<commit_message>
changing the fundemental way of compression
</commit_message>
<xml_diff>
--- a/projet thermodynamique.docx
+++ b/projet thermodynamique.docx
@@ -3308,8 +3308,9 @@
           <w:sz w:val="28"/>
           <w:szCs w:val="28"/>
         </w:rPr>
-        <w:t xml:space="preserve"> </w:t>
-      </w:r>
+        <w:t xml:space="preserve"> Etude de l’impact de variation de </w:t>
+      </w:r>
+      <w:proofErr w:type="spellStart"/>
       <w:r>
         <w:rPr>
           <w:rFonts w:ascii="Arial" w:hAnsi="Arial" w:cs="Arial"/>
@@ -3318,9 +3319,9 @@
           <w:sz w:val="28"/>
           <w:szCs w:val="28"/>
         </w:rPr>
-        <w:t xml:space="preserve">Etude de l’impact de variation de </w:t>
-      </w:r>
-      <w:proofErr w:type="spellStart"/>
+        <w:t>Tfroid</w:t>
+      </w:r>
+      <w:proofErr w:type="spellEnd"/>
       <w:r>
         <w:rPr>
           <w:rFonts w:ascii="Arial" w:hAnsi="Arial" w:cs="Arial"/>
@@ -3329,27 +3330,6 @@
           <w:sz w:val="28"/>
           <w:szCs w:val="28"/>
         </w:rPr>
-        <w:t>T</w:t>
-      </w:r>
-      <w:r>
-        <w:rPr>
-          <w:rFonts w:ascii="Arial" w:hAnsi="Arial" w:cs="Arial"/>
-          <w:b/>
-          <w:bCs/>
-          <w:sz w:val="28"/>
-          <w:szCs w:val="28"/>
-        </w:rPr>
-        <w:t>froid</w:t>
-      </w:r>
-      <w:proofErr w:type="spellEnd"/>
-      <w:r>
-        <w:rPr>
-          <w:rFonts w:ascii="Arial" w:hAnsi="Arial" w:cs="Arial"/>
-          <w:b/>
-          <w:bCs/>
-          <w:sz w:val="28"/>
-          <w:szCs w:val="28"/>
-        </w:rPr>
         <w:t> :</w:t>
       </w:r>
     </w:p>
@@ -3608,18 +3588,8 @@
           <w:sz w:val="20"/>
           <w:szCs w:val="20"/>
         </w:rPr>
-        <w:t>T</w:t>
-      </w:r>
-      <w:r>
-        <w:rPr>
-          <w:rFonts w:asciiTheme="minorBidi" w:hAnsiTheme="minorBidi"/>
-          <w:sz w:val="20"/>
-          <w:szCs w:val="20"/>
-        </w:rPr>
-        <w:t>Froid</w:t>
-      </w:r>
-      <w:bookmarkStart w:id="0" w:name="_GoBack"/>
-      <w:bookmarkEnd w:id="0"/>
+        <w:t>TFroid</w:t>
+      </w:r>
       <w:r>
         <w:rPr>
           <w:rFonts w:asciiTheme="minorBidi" w:hAnsiTheme="minorBidi"/>
@@ -6547,7 +6517,38 @@
           <w:szCs w:val="28"/>
           <w:lang w:eastAsia="fr-FR"/>
         </w:rPr>
-        <w:t>Le fluide est comprimé, sa pression et sa température augmentent simultanément. À chaque pas, le travail idéal est évalué à entropie constante</w:t>
+        <w:t xml:space="preserve">Le fluide est comprimé, sa pression et sa température augmentent simultanément. À chaque pas, le travail idéal est évalué à </w:t>
+      </w:r>
+      <w:proofErr w:type="spellStart"/>
+      <w:r>
+        <w:rPr>
+          <w:rFonts w:ascii="Times New Roman" w:eastAsia="Times New Roman" w:hAnsi="Times New Roman" w:cs="Times New Roman"/>
+          <w:sz w:val="28"/>
+          <w:szCs w:val="28"/>
+          <w:lang w:eastAsia="fr-FR"/>
+        </w:rPr>
+        <w:t>temperature</w:t>
+      </w:r>
+      <w:proofErr w:type="spellEnd"/>
+      <w:r>
+        <w:rPr>
+          <w:rFonts w:ascii="Times New Roman" w:eastAsia="Times New Roman" w:hAnsi="Times New Roman" w:cs="Times New Roman"/>
+          <w:sz w:val="28"/>
+          <w:szCs w:val="28"/>
+          <w:lang w:eastAsia="fr-FR"/>
+        </w:rPr>
+        <w:t xml:space="preserve"> </w:t>
+      </w:r>
+      <w:bookmarkStart w:id="0" w:name="_GoBack"/>
+      <w:bookmarkEnd w:id="0"/>
+      <w:r>
+        <w:rPr>
+          <w:rFonts w:ascii="Times New Roman" w:eastAsia="Times New Roman" w:hAnsi="Times New Roman" w:cs="Times New Roman"/>
+          <w:sz w:val="28"/>
+          <w:szCs w:val="28"/>
+          <w:lang w:eastAsia="fr-FR"/>
+        </w:rPr>
+        <w:t>constante</w:t>
       </w:r>
       <w:r>
         <w:rPr>
@@ -6566,7 +6567,25 @@
             <w:szCs w:val="28"/>
             <w:lang w:eastAsia="fr-FR"/>
           </w:rPr>
-          <m:t>∆S=0</m:t>
+          <m:t>∆</m:t>
+        </m:r>
+        <m:r>
+          <w:rPr>
+            <w:rFonts w:ascii="Cambria Math" w:eastAsia="Times New Roman" w:hAnsi="Cambria Math" w:cs="Times New Roman"/>
+            <w:sz w:val="28"/>
+            <w:szCs w:val="28"/>
+            <w:lang w:eastAsia="fr-FR"/>
+          </w:rPr>
+          <m:t>T</m:t>
+        </m:r>
+        <m:r>
+          <w:rPr>
+            <w:rFonts w:ascii="Cambria Math" w:eastAsia="Times New Roman" w:hAnsi="Cambria Math" w:cs="Times New Roman"/>
+            <w:sz w:val="28"/>
+            <w:szCs w:val="28"/>
+            <w:lang w:eastAsia="fr-FR"/>
+          </w:rPr>
+          <m:t>=0</m:t>
         </m:r>
       </m:oMath>
       <w:r>
@@ -16708,7 +16727,7 @@
 </file>
 
 <file path=customXml/itemProps1.xml><?xml version="1.0" encoding="utf-8"?>
-<ds:datastoreItem xmlns:ds="http://schemas.openxmlformats.org/officeDocument/2006/customXml" ds:itemID="{74ED1E19-251F-4129-8F6F-0D0138951C6E}">
+<ds:datastoreItem xmlns:ds="http://schemas.openxmlformats.org/officeDocument/2006/customXml" ds:itemID="{CF2A5BD0-BF7D-467A-9594-D97C869119F8}">
   <ds:schemaRefs>
     <ds:schemaRef ds:uri="http://schemas.openxmlformats.org/officeDocument/2006/bibliography"/>
   </ds:schemaRefs>

</xml_diff>

<commit_message>
basic component for simulation has been developed
</commit_message>
<xml_diff>
--- a/projet thermodynamique.docx
+++ b/projet thermodynamique.docx
@@ -6539,8 +6539,6 @@
         </w:rPr>
         <w:t xml:space="preserve"> </w:t>
       </w:r>
-      <w:bookmarkStart w:id="0" w:name="_GoBack"/>
-      <w:bookmarkEnd w:id="0"/>
       <w:r>
         <w:rPr>
           <w:rFonts w:ascii="Times New Roman" w:eastAsia="Times New Roman" w:hAnsi="Times New Roman" w:cs="Times New Roman"/>
@@ -6567,25 +6565,7 @@
             <w:szCs w:val="28"/>
             <w:lang w:eastAsia="fr-FR"/>
           </w:rPr>
-          <m:t>∆</m:t>
-        </m:r>
-        <m:r>
-          <w:rPr>
-            <w:rFonts w:ascii="Cambria Math" w:eastAsia="Times New Roman" w:hAnsi="Cambria Math" w:cs="Times New Roman"/>
-            <w:sz w:val="28"/>
-            <w:szCs w:val="28"/>
-            <w:lang w:eastAsia="fr-FR"/>
-          </w:rPr>
-          <m:t>T</m:t>
-        </m:r>
-        <m:r>
-          <w:rPr>
-            <w:rFonts w:ascii="Cambria Math" w:eastAsia="Times New Roman" w:hAnsi="Cambria Math" w:cs="Times New Roman"/>
-            <w:sz w:val="28"/>
-            <w:szCs w:val="28"/>
-            <w:lang w:eastAsia="fr-FR"/>
-          </w:rPr>
-          <m:t>=0</m:t>
+          <m:t>∆T=0</m:t>
         </m:r>
       </m:oMath>
       <w:r>
@@ -7697,7 +7677,17 @@
               <w:sz w:val="28"/>
               <w:szCs w:val="28"/>
             </w:rPr>
-            <m:t>=0.01</m:t>
+            <m:t>=0.</m:t>
+          </m:r>
+          <w:bookmarkStart w:id="0" w:name="_GoBack"/>
+          <w:bookmarkEnd w:id="0"/>
+          <m:r>
+            <w:rPr>
+              <w:rFonts w:ascii="Cambria Math" w:hAnsi="Cambria Math"/>
+              <w:sz w:val="28"/>
+              <w:szCs w:val="28"/>
+            </w:rPr>
+            <m:t>1</m:t>
           </m:r>
           <m:r>
             <w:rPr>
@@ -16727,7 +16717,7 @@
 </file>
 
 <file path=customXml/itemProps1.xml><?xml version="1.0" encoding="utf-8"?>
-<ds:datastoreItem xmlns:ds="http://schemas.openxmlformats.org/officeDocument/2006/customXml" ds:itemID="{CF2A5BD0-BF7D-467A-9594-D97C869119F8}">
+<ds:datastoreItem xmlns:ds="http://schemas.openxmlformats.org/officeDocument/2006/customXml" ds:itemID="{C977E86E-4216-4DFA-B3E3-3F8E7FC26EBC}">
   <ds:schemaRefs>
     <ds:schemaRef ds:uri="http://schemas.openxmlformats.org/officeDocument/2006/bibliography"/>
   </ds:schemaRefs>

</xml_diff>